<commit_message>
update kernel headers install method
</commit_message>
<xml_diff>
--- a/Documents/CAM-MIPI7251RAW UserManual.docx
+++ b/Documents/CAM-MIPI7251RAW UserManual.docx
@@ -146,6 +146,12 @@
             <w:insideH w:val="single" w:color="auto" w:sz="4" w:space="0"/>
             <w:insideV w:val="single" w:color="auto" w:sz="4" w:space="0"/>
           </w:tblBorders>
+          <w:tblCellMar>
+            <w:top w:w="0" w:type="dxa"/>
+            <w:left w:w="108" w:type="dxa"/>
+            <w:bottom w:w="0" w:type="dxa"/>
+            <w:right w:w="108" w:type="dxa"/>
+          </w:tblCellMar>
         </w:tblPrEx>
         <w:tc>
           <w:tcPr>
@@ -2783,8 +2789,10 @@
                 <w:sz w:val="21"/>
                 <w:szCs w:val="24"/>
               </w:rPr>
-              <w:t>$sudo apt-get install raspberrypi-kernel-headers-$(uname -r)</w:t>
-            </w:r>
+              <w:t>$sudo apt-get install raspberrypi-kernel-headers</w:t>
+            </w:r>
+            <w:bookmarkStart w:id="0" w:name="_GoBack"/>
+            <w:bookmarkEnd w:id="0"/>
           </w:p>
         </w:tc>
       </w:tr>
@@ -2844,6 +2852,12 @@
             <w:insideH w:val="single" w:color="auto" w:sz="4" w:space="0"/>
             <w:insideV w:val="single" w:color="auto" w:sz="4" w:space="0"/>
           </w:tblBorders>
+          <w:tblCellMar>
+            <w:top w:w="0" w:type="dxa"/>
+            <w:left w:w="108" w:type="dxa"/>
+            <w:bottom w:w="0" w:type="dxa"/>
+            <w:right w:w="108" w:type="dxa"/>
+          </w:tblCellMar>
         </w:tblPrEx>
         <w:tc>
           <w:tcPr>
@@ -3012,12 +3026,6 @@
                   <w:insideH w:val="single" w:color="auto" w:sz="4" w:space="0"/>
                   <w:insideV w:val="single" w:color="auto" w:sz="4" w:space="0"/>
                 </w:tblBorders>
-                <w:tblCellMar>
-                  <w:top w:w="0" w:type="dxa"/>
-                  <w:left w:w="108" w:type="dxa"/>
-                  <w:bottom w:w="0" w:type="dxa"/>
-                  <w:right w:w="108" w:type="dxa"/>
-                </w:tblCellMar>
               </w:tblPrEx>
               <w:trPr>
                 <w:trHeight w:val="90" w:hRule="atLeast"/>
@@ -3337,6 +3345,12 @@
             <w:insideH w:val="single" w:color="auto" w:sz="4" w:space="0"/>
             <w:insideV w:val="single" w:color="auto" w:sz="4" w:space="0"/>
           </w:tblBorders>
+          <w:tblCellMar>
+            <w:top w:w="0" w:type="dxa"/>
+            <w:left w:w="108" w:type="dxa"/>
+            <w:bottom w:w="0" w:type="dxa"/>
+            <w:right w:w="108" w:type="dxa"/>
+          </w:tblCellMar>
         </w:tblPrEx>
         <w:tc>
           <w:tcPr>
@@ -3455,6 +3469,12 @@
             <w:insideV w:val="single" w:color="auto" w:sz="4" w:space="0"/>
           </w:tblBorders>
           <w:shd w:val="clear" w:color="auto" w:fill="9ED3A3" w:themeFill="background1" w:themeFillShade="D8"/>
+          <w:tblCellMar>
+            <w:top w:w="0" w:type="dxa"/>
+            <w:left w:w="108" w:type="dxa"/>
+            <w:bottom w:w="0" w:type="dxa"/>
+            <w:right w:w="108" w:type="dxa"/>
+          </w:tblCellMar>
         </w:tblPrEx>
         <w:tc>
           <w:tcPr>
@@ -3731,13 +3751,6 @@
             <w:insideH w:val="single" w:color="auto" w:sz="4" w:space="0"/>
             <w:insideV w:val="single" w:color="auto" w:sz="4" w:space="0"/>
           </w:tblBorders>
-          <w:shd w:val="clear" w:color="auto" w:fill="9ED3A3" w:themeFill="background1" w:themeFillShade="D8"/>
-          <w:tblCellMar>
-            <w:top w:w="0" w:type="dxa"/>
-            <w:left w:w="108" w:type="dxa"/>
-            <w:bottom w:w="0" w:type="dxa"/>
-            <w:right w:w="108" w:type="dxa"/>
-          </w:tblCellMar>
         </w:tblPrEx>
         <w:tc>
           <w:tcPr>
@@ -4839,12 +4852,6 @@
             <w:insideH w:val="single" w:color="auto" w:sz="4" w:space="0"/>
             <w:insideV w:val="single" w:color="auto" w:sz="4" w:space="0"/>
           </w:tblBorders>
-          <w:tblCellMar>
-            <w:top w:w="0" w:type="dxa"/>
-            <w:left w:w="108" w:type="dxa"/>
-            <w:bottom w:w="0" w:type="dxa"/>
-            <w:right w:w="108" w:type="dxa"/>
-          </w:tblCellMar>
         </w:tblPrEx>
         <w:tc>
           <w:tcPr>
@@ -4869,8 +4876,6 @@
               </w:rPr>
               <w:t>inno</w:t>
             </w:r>
-            <w:bookmarkStart w:id="0" w:name="_GoBack"/>
-            <w:bookmarkEnd w:id="0"/>
             <w:r>
               <w:t>_mipi_ov7251</w:t>
             </w:r>
@@ -5132,12 +5137,6 @@
             <w:insideH w:val="single" w:color="auto" w:sz="4" w:space="0"/>
             <w:insideV w:val="single" w:color="auto" w:sz="4" w:space="0"/>
           </w:tblBorders>
-          <w:tblCellMar>
-            <w:top w:w="0" w:type="dxa"/>
-            <w:left w:w="108" w:type="dxa"/>
-            <w:bottom w:w="0" w:type="dxa"/>
-            <w:right w:w="108" w:type="dxa"/>
-          </w:tblCellMar>
         </w:tblPrEx>
         <w:tc>
           <w:tcPr>
@@ -5207,6 +5206,253 @@
       </w:r>
       <w:r>
         <w:t>Set the sensor module back to external hardware trigger mode by:</w:t>
+      </w:r>
+    </w:p>
+    <w:tbl>
+      <w:tblPr>
+        <w:tblStyle w:val="8"/>
+        <w:tblW w:w="0" w:type="auto"/>
+        <w:tblInd w:w="0" w:type="dxa"/>
+        <w:tblBorders>
+          <w:top w:val="single" w:color="auto" w:sz="4" w:space="0"/>
+          <w:left w:val="single" w:color="auto" w:sz="4" w:space="0"/>
+          <w:bottom w:val="single" w:color="auto" w:sz="4" w:space="0"/>
+          <w:right w:val="single" w:color="auto" w:sz="4" w:space="0"/>
+          <w:insideH w:val="single" w:color="auto" w:sz="4" w:space="0"/>
+          <w:insideV w:val="single" w:color="auto" w:sz="4" w:space="0"/>
+        </w:tblBorders>
+        <w:tblLayout w:type="autofit"/>
+        <w:tblCellMar>
+          <w:top w:w="0" w:type="dxa"/>
+          <w:left w:w="108" w:type="dxa"/>
+          <w:bottom w:w="0" w:type="dxa"/>
+          <w:right w:w="108" w:type="dxa"/>
+        </w:tblCellMar>
+      </w:tblPr>
+      <w:tblGrid>
+        <w:gridCol w:w="8522"/>
+      </w:tblGrid>
+      <w:tr>
+        <w:tblPrEx>
+          <w:tblBorders>
+            <w:top w:val="single" w:color="auto" w:sz="4" w:space="0"/>
+            <w:left w:val="single" w:color="auto" w:sz="4" w:space="0"/>
+            <w:bottom w:val="single" w:color="auto" w:sz="4" w:space="0"/>
+            <w:right w:val="single" w:color="auto" w:sz="4" w:space="0"/>
+            <w:insideH w:val="single" w:color="auto" w:sz="4" w:space="0"/>
+            <w:insideV w:val="single" w:color="auto" w:sz="4" w:space="0"/>
+          </w:tblBorders>
+        </w:tblPrEx>
+        <w:tc>
+          <w:tcPr>
+            <w:tcW w:w="8522" w:type="dxa"/>
+            <w:shd w:val="clear" w:color="auto" w:fill="80C588" w:themeFill="background1" w:themeFillShade="BF"/>
+          </w:tcPr>
+          <w:p>
+            <w:pPr>
+              <w:rPr>
+                <w:rFonts w:hint="eastAsia"/>
+                <w:vertAlign w:val="baseline"/>
+              </w:rPr>
+            </w:pPr>
+            <w:r>
+              <w:rPr>
+                <w:rFonts w:hint="eastAsia"/>
+              </w:rPr>
+              <w:t>$</w:t>
+            </w:r>
+            <w:r>
+              <w:t xml:space="preserve"> i2cset -f -y 10 0x10 204 0</w:t>
+            </w:r>
+          </w:p>
+        </w:tc>
+      </w:tr>
+    </w:tbl>
+    <w:p/>
+    <w:p>
+      <w:pPr>
+        <w:pStyle w:val="3"/>
+        <w:bidi w:val="0"/>
+        <w:rPr>
+          <w:rFonts w:hint="eastAsia"/>
+          <w:lang w:val="en-US" w:eastAsia="zh-CN"/>
+        </w:rPr>
+      </w:pPr>
+      <w:r>
+        <w:rPr>
+          <w:rFonts w:hint="eastAsia"/>
+          <w:lang w:val="en-US" w:eastAsia="zh-CN"/>
+        </w:rPr>
+        <w:t>Wire connection</w:t>
+      </w:r>
+    </w:p>
+    <w:p>
+      <w:pPr>
+        <w:keepNext w:val="0"/>
+        <w:keepLines w:val="0"/>
+        <w:widowControl/>
+        <w:suppressLineNumbers w:val="0"/>
+        <w:jc w:val="left"/>
+      </w:pPr>
+      <w:r>
+        <w:rPr>
+          <w:rFonts w:ascii="Calibri" w:hAnsi="Calibri" w:eastAsia="宋体" w:cs="Calibri"/>
+          <w:color w:val="000000"/>
+          <w:kern w:val="0"/>
+          <w:sz w:val="20"/>
+          <w:szCs w:val="20"/>
+          <w:lang w:val="en-US" w:eastAsia="zh-CN" w:bidi="ar"/>
+        </w:rPr>
+        <w:t>You can connect the TRIG- to the GND Pin and connect the TRIG+ to 3.3V Pin of Raspberry Pi to</w:t>
+      </w:r>
+    </w:p>
+    <w:p>
+      <w:pPr>
+        <w:keepNext w:val="0"/>
+        <w:keepLines w:val="0"/>
+        <w:widowControl/>
+        <w:suppressLineNumbers w:val="0"/>
+        <w:jc w:val="left"/>
+        <w:rPr>
+          <w:rFonts w:hint="default" w:ascii="Calibri" w:hAnsi="Calibri" w:eastAsia="宋体" w:cs="Calibri"/>
+          <w:color w:val="000000"/>
+          <w:kern w:val="0"/>
+          <w:sz w:val="20"/>
+          <w:szCs w:val="20"/>
+          <w:lang w:val="en-US" w:eastAsia="zh-CN" w:bidi="ar"/>
+        </w:rPr>
+      </w:pPr>
+      <w:r>
+        <w:rPr>
+          <w:rFonts w:hint="default" w:ascii="Calibri" w:hAnsi="Calibri" w:eastAsia="宋体" w:cs="Calibri"/>
+          <w:color w:val="000000"/>
+          <w:kern w:val="0"/>
+          <w:sz w:val="20"/>
+          <w:szCs w:val="20"/>
+          <w:lang w:val="en-US" w:eastAsia="zh-CN" w:bidi="ar"/>
+        </w:rPr>
+        <w:t>simulate a trigger signal. This test function will comes with repeated trigger signal sometime.</w:t>
+      </w:r>
+    </w:p>
+    <w:p>
+      <w:pPr>
+        <w:keepNext w:val="0"/>
+        <w:keepLines w:val="0"/>
+        <w:widowControl/>
+        <w:suppressLineNumbers w:val="0"/>
+        <w:jc w:val="left"/>
+        <w:rPr>
+          <w:rFonts w:hint="default" w:ascii="Calibri" w:hAnsi="Calibri" w:eastAsia="宋体" w:cs="Calibri"/>
+          <w:color w:val="000000"/>
+          <w:kern w:val="0"/>
+          <w:sz w:val="20"/>
+          <w:szCs w:val="20"/>
+          <w:lang w:val="en-US" w:eastAsia="zh-CN" w:bidi="ar"/>
+        </w:rPr>
+      </w:pPr>
+      <w:r>
+        <w:drawing>
+          <wp:inline distT="0" distB="0" distL="114300" distR="114300">
+            <wp:extent cx="4798060" cy="4798060"/>
+            <wp:effectExtent l="0" t="0" r="2540" b="2540"/>
+            <wp:docPr id="20" name="图片 17"/>
+            <wp:cNvGraphicFramePr>
+              <a:graphicFrameLocks xmlns:a="http://schemas.openxmlformats.org/drawingml/2006/main" noChangeAspect="1"/>
+            </wp:cNvGraphicFramePr>
+            <a:graphic xmlns:a="http://schemas.openxmlformats.org/drawingml/2006/main">
+              <a:graphicData uri="http://schemas.openxmlformats.org/drawingml/2006/picture">
+                <pic:pic xmlns:pic="http://schemas.openxmlformats.org/drawingml/2006/picture">
+                  <pic:nvPicPr>
+                    <pic:cNvPr id="20" name="图片 17"/>
+                    <pic:cNvPicPr>
+                      <a:picLocks noChangeAspect="1"/>
+                    </pic:cNvPicPr>
+                  </pic:nvPicPr>
+                  <pic:blipFill>
+                    <a:blip r:embed="rId23"/>
+                    <a:stretch>
+                      <a:fillRect/>
+                    </a:stretch>
+                  </pic:blipFill>
+                  <pic:spPr>
+                    <a:xfrm>
+                      <a:off x="0" y="0"/>
+                      <a:ext cx="4798060" cy="4798060"/>
+                    </a:xfrm>
+                    <a:prstGeom prst="rect">
+                      <a:avLst/>
+                    </a:prstGeom>
+                    <a:noFill/>
+                    <a:ln>
+                      <a:noFill/>
+                    </a:ln>
+                  </pic:spPr>
+                </pic:pic>
+              </a:graphicData>
+            </a:graphic>
+          </wp:inline>
+        </w:drawing>
+      </w:r>
+      <w:r>
+        <w:drawing>
+          <wp:inline distT="0" distB="0" distL="114300" distR="114300">
+            <wp:extent cx="1790700" cy="781050"/>
+            <wp:effectExtent l="0" t="0" r="0" b="0"/>
+            <wp:docPr id="21" name="图片 18"/>
+            <wp:cNvGraphicFramePr>
+              <a:graphicFrameLocks xmlns:a="http://schemas.openxmlformats.org/drawingml/2006/main" noChangeAspect="1"/>
+            </wp:cNvGraphicFramePr>
+            <a:graphic xmlns:a="http://schemas.openxmlformats.org/drawingml/2006/main">
+              <a:graphicData uri="http://schemas.openxmlformats.org/drawingml/2006/picture">
+                <pic:pic xmlns:pic="http://schemas.openxmlformats.org/drawingml/2006/picture">
+                  <pic:nvPicPr>
+                    <pic:cNvPr id="21" name="图片 18"/>
+                    <pic:cNvPicPr>
+                      <a:picLocks noChangeAspect="1"/>
+                    </pic:cNvPicPr>
+                  </pic:nvPicPr>
+                  <pic:blipFill>
+                    <a:blip r:embed="rId24"/>
+                    <a:stretch>
+                      <a:fillRect/>
+                    </a:stretch>
+                  </pic:blipFill>
+                  <pic:spPr>
+                    <a:xfrm>
+                      <a:off x="0" y="0"/>
+                      <a:ext cx="1790700" cy="781050"/>
+                    </a:xfrm>
+                    <a:prstGeom prst="rect">
+                      <a:avLst/>
+                    </a:prstGeom>
+                    <a:noFill/>
+                    <a:ln>
+                      <a:noFill/>
+                    </a:ln>
+                  </pic:spPr>
+                </pic:pic>
+              </a:graphicData>
+            </a:graphic>
+          </wp:inline>
+        </w:drawing>
+      </w:r>
+    </w:p>
+    <w:p>
+      <w:pPr>
+        <w:rPr>
+          <w:rFonts w:hint="default"/>
+          <w:lang w:val="en-US" w:eastAsia="zh-CN"/>
+        </w:rPr>
+      </w:pPr>
+    </w:p>
+    <w:p>
+      <w:r>
+        <w:t>Step1 : set camera work in external trigger mode.</w:t>
+      </w:r>
+    </w:p>
+    <w:p>
+      <w:r>
+        <w:t>For example set the module work in mode3</w:t>
       </w:r>
     </w:p>
     <w:tbl>
@@ -5269,197 +5515,25 @@
               <w:t>$</w:t>
             </w:r>
             <w:r>
-              <w:t xml:space="preserve"> i2cset -f -y 10 0x10 204 0</w:t>
+              <w:t xml:space="preserve"> sudo make setmode3</w:t>
             </w:r>
           </w:p>
         </w:tc>
       </w:tr>
     </w:tbl>
-    <w:p/>
-    <w:p>
-      <w:pPr>
-        <w:pStyle w:val="3"/>
-        <w:bidi w:val="0"/>
-        <w:rPr>
-          <w:rFonts w:hint="eastAsia"/>
-          <w:lang w:val="en-US" w:eastAsia="zh-CN"/>
-        </w:rPr>
-      </w:pPr>
-      <w:r>
-        <w:rPr>
-          <w:rFonts w:hint="eastAsia"/>
-          <w:lang w:val="en-US" w:eastAsia="zh-CN"/>
-        </w:rPr>
-        <w:t>Wire connection</w:t>
-      </w:r>
-    </w:p>
-    <w:p>
-      <w:pPr>
-        <w:keepNext w:val="0"/>
-        <w:keepLines w:val="0"/>
-        <w:widowControl/>
-        <w:suppressLineNumbers w:val="0"/>
-        <w:jc w:val="left"/>
-      </w:pPr>
-      <w:r>
-        <w:rPr>
-          <w:rFonts w:ascii="Calibri" w:hAnsi="Calibri" w:eastAsia="宋体" w:cs="Calibri"/>
-          <w:color w:val="000000"/>
-          <w:kern w:val="0"/>
-          <w:sz w:val="20"/>
-          <w:szCs w:val="20"/>
-          <w:lang w:val="en-US" w:eastAsia="zh-CN" w:bidi="ar"/>
-        </w:rPr>
-        <w:t>You can connect the TRIG- to the GND Pin and connect the TRIG+ to 3.3V Pin of Raspberry Pi to</w:t>
-      </w:r>
-    </w:p>
-    <w:p>
-      <w:pPr>
-        <w:keepNext w:val="0"/>
-        <w:keepLines w:val="0"/>
-        <w:widowControl/>
-        <w:suppressLineNumbers w:val="0"/>
-        <w:jc w:val="left"/>
-        <w:rPr>
-          <w:rFonts w:hint="default" w:ascii="Calibri" w:hAnsi="Calibri" w:eastAsia="宋体" w:cs="Calibri"/>
-          <w:color w:val="000000"/>
-          <w:kern w:val="0"/>
-          <w:sz w:val="20"/>
-          <w:szCs w:val="20"/>
-          <w:lang w:val="en-US" w:eastAsia="zh-CN" w:bidi="ar"/>
-        </w:rPr>
-      </w:pPr>
-      <w:r>
-        <w:rPr>
-          <w:rFonts w:hint="default" w:ascii="Calibri" w:hAnsi="Calibri" w:eastAsia="宋体" w:cs="Calibri"/>
-          <w:color w:val="000000"/>
-          <w:kern w:val="0"/>
-          <w:sz w:val="20"/>
-          <w:szCs w:val="20"/>
-          <w:lang w:val="en-US" w:eastAsia="zh-CN" w:bidi="ar"/>
-        </w:rPr>
-        <w:t>simulate a trigger signal. This test function will comes with repeated trigger signal sometime.</w:t>
-      </w:r>
-    </w:p>
-    <w:p>
-      <w:pPr>
-        <w:keepNext w:val="0"/>
-        <w:keepLines w:val="0"/>
-        <w:widowControl/>
-        <w:suppressLineNumbers w:val="0"/>
-        <w:jc w:val="left"/>
-        <w:rPr>
-          <w:rFonts w:hint="default" w:ascii="Calibri" w:hAnsi="Calibri" w:eastAsia="宋体" w:cs="Calibri"/>
-          <w:color w:val="000000"/>
-          <w:kern w:val="0"/>
-          <w:sz w:val="20"/>
-          <w:szCs w:val="20"/>
-          <w:lang w:val="en-US" w:eastAsia="zh-CN" w:bidi="ar"/>
-        </w:rPr>
-      </w:pPr>
-      <w:r>
-        <w:drawing>
-          <wp:inline distT="0" distB="0" distL="114300" distR="114300">
-            <wp:extent cx="4798060" cy="4798060"/>
-            <wp:effectExtent l="0" t="0" r="2540" b="2540"/>
-            <wp:docPr id="20" name="图片 17"/>
-            <wp:cNvGraphicFramePr>
-              <a:graphicFrameLocks xmlns:a="http://schemas.openxmlformats.org/drawingml/2006/main" noChangeAspect="1"/>
-            </wp:cNvGraphicFramePr>
-            <a:graphic xmlns:a="http://schemas.openxmlformats.org/drawingml/2006/main">
-              <a:graphicData uri="http://schemas.openxmlformats.org/drawingml/2006/picture">
-                <pic:pic xmlns:pic="http://schemas.openxmlformats.org/drawingml/2006/picture">
-                  <pic:nvPicPr>
-                    <pic:cNvPr id="20" name="图片 17"/>
-                    <pic:cNvPicPr>
-                      <a:picLocks noChangeAspect="1"/>
-                    </pic:cNvPicPr>
-                  </pic:nvPicPr>
-                  <pic:blipFill>
-                    <a:blip r:embed="rId23"/>
-                    <a:stretch>
-                      <a:fillRect/>
-                    </a:stretch>
-                  </pic:blipFill>
-                  <pic:spPr>
-                    <a:xfrm>
-                      <a:off x="0" y="0"/>
-                      <a:ext cx="4798060" cy="4798060"/>
-                    </a:xfrm>
-                    <a:prstGeom prst="rect">
-                      <a:avLst/>
-                    </a:prstGeom>
-                    <a:noFill/>
-                    <a:ln>
-                      <a:noFill/>
-                    </a:ln>
-                  </pic:spPr>
-                </pic:pic>
-              </a:graphicData>
-            </a:graphic>
-          </wp:inline>
-        </w:drawing>
-      </w:r>
-      <w:r>
-        <w:drawing>
-          <wp:inline distT="0" distB="0" distL="114300" distR="114300">
-            <wp:extent cx="1790700" cy="781050"/>
-            <wp:effectExtent l="0" t="0" r="0" b="0"/>
-            <wp:docPr id="21" name="图片 18"/>
-            <wp:cNvGraphicFramePr>
-              <a:graphicFrameLocks xmlns:a="http://schemas.openxmlformats.org/drawingml/2006/main" noChangeAspect="1"/>
-            </wp:cNvGraphicFramePr>
-            <a:graphic xmlns:a="http://schemas.openxmlformats.org/drawingml/2006/main">
-              <a:graphicData uri="http://schemas.openxmlformats.org/drawingml/2006/picture">
-                <pic:pic xmlns:pic="http://schemas.openxmlformats.org/drawingml/2006/picture">
-                  <pic:nvPicPr>
-                    <pic:cNvPr id="21" name="图片 18"/>
-                    <pic:cNvPicPr>
-                      <a:picLocks noChangeAspect="1"/>
-                    </pic:cNvPicPr>
-                  </pic:nvPicPr>
-                  <pic:blipFill>
-                    <a:blip r:embed="rId24"/>
-                    <a:stretch>
-                      <a:fillRect/>
-                    </a:stretch>
-                  </pic:blipFill>
-                  <pic:spPr>
-                    <a:xfrm>
-                      <a:off x="0" y="0"/>
-                      <a:ext cx="1790700" cy="781050"/>
-                    </a:xfrm>
-                    <a:prstGeom prst="rect">
-                      <a:avLst/>
-                    </a:prstGeom>
-                    <a:noFill/>
-                    <a:ln>
-                      <a:noFill/>
-                    </a:ln>
-                  </pic:spPr>
-                </pic:pic>
-              </a:graphicData>
-            </a:graphic>
-          </wp:inline>
-        </w:drawing>
-      </w:r>
-    </w:p>
-    <w:p>
-      <w:pPr>
-        <w:rPr>
-          <w:rFonts w:hint="default"/>
-          <w:lang w:val="en-US" w:eastAsia="zh-CN"/>
-        </w:rPr>
-      </w:pPr>
-    </w:p>
-    <w:p>
-      <w:r>
-        <w:t>Step1 : set camera work in external trigger mode.</w:t>
-      </w:r>
-    </w:p>
-    <w:p>
-      <w:r>
-        <w:t>For example set the module work in mode3</w:t>
+    <w:p>
+      <w:r>
+        <w:t xml:space="preserve">Open /dev/video0 device in VLC </w:t>
+      </w:r>
+    </w:p>
+    <w:p>
+      <w:r>
+        <w:t>Step2: Put external trigger signal through TRIG pin head.</w:t>
+      </w:r>
+    </w:p>
+    <w:p>
+      <w:r>
+        <w:t>For example a 3.3v gpio rising edge signal will trigger the frame output.</w:t>
       </w:r>
     </w:p>
     <w:tbl>
@@ -5496,87 +5570,6 @@
             <w:insideH w:val="single" w:color="auto" w:sz="4" w:space="0"/>
             <w:insideV w:val="single" w:color="auto" w:sz="4" w:space="0"/>
           </w:tblBorders>
-        </w:tblPrEx>
-        <w:tc>
-          <w:tcPr>
-            <w:tcW w:w="8522" w:type="dxa"/>
-            <w:shd w:val="clear" w:color="auto" w:fill="80C588" w:themeFill="background1" w:themeFillShade="BF"/>
-          </w:tcPr>
-          <w:p>
-            <w:pPr>
-              <w:rPr>
-                <w:rFonts w:hint="eastAsia"/>
-                <w:vertAlign w:val="baseline"/>
-              </w:rPr>
-            </w:pPr>
-            <w:r>
-              <w:rPr>
-                <w:rFonts w:hint="eastAsia"/>
-              </w:rPr>
-              <w:t>$</w:t>
-            </w:r>
-            <w:r>
-              <w:t xml:space="preserve"> sudo make setmode3</w:t>
-            </w:r>
-          </w:p>
-        </w:tc>
-      </w:tr>
-    </w:tbl>
-    <w:p>
-      <w:r>
-        <w:t xml:space="preserve">Open /dev/video0 device in VLC </w:t>
-      </w:r>
-    </w:p>
-    <w:p>
-      <w:r>
-        <w:t>Step2: Put external trigger signal through TRIG pin head.</w:t>
-      </w:r>
-    </w:p>
-    <w:p>
-      <w:r>
-        <w:t>For example a 3.3v gpio rising edge signal will trigger the frame output.</w:t>
-      </w:r>
-    </w:p>
-    <w:tbl>
-      <w:tblPr>
-        <w:tblStyle w:val="8"/>
-        <w:tblW w:w="0" w:type="auto"/>
-        <w:tblInd w:w="0" w:type="dxa"/>
-        <w:tblBorders>
-          <w:top w:val="single" w:color="auto" w:sz="4" w:space="0"/>
-          <w:left w:val="single" w:color="auto" w:sz="4" w:space="0"/>
-          <w:bottom w:val="single" w:color="auto" w:sz="4" w:space="0"/>
-          <w:right w:val="single" w:color="auto" w:sz="4" w:space="0"/>
-          <w:insideH w:val="single" w:color="auto" w:sz="4" w:space="0"/>
-          <w:insideV w:val="single" w:color="auto" w:sz="4" w:space="0"/>
-        </w:tblBorders>
-        <w:tblLayout w:type="autofit"/>
-        <w:tblCellMar>
-          <w:top w:w="0" w:type="dxa"/>
-          <w:left w:w="108" w:type="dxa"/>
-          <w:bottom w:w="0" w:type="dxa"/>
-          <w:right w:w="108" w:type="dxa"/>
-        </w:tblCellMar>
-      </w:tblPr>
-      <w:tblGrid>
-        <w:gridCol w:w="8522"/>
-      </w:tblGrid>
-      <w:tr>
-        <w:tblPrEx>
-          <w:tblBorders>
-            <w:top w:val="single" w:color="auto" w:sz="4" w:space="0"/>
-            <w:left w:val="single" w:color="auto" w:sz="4" w:space="0"/>
-            <w:bottom w:val="single" w:color="auto" w:sz="4" w:space="0"/>
-            <w:right w:val="single" w:color="auto" w:sz="4" w:space="0"/>
-            <w:insideH w:val="single" w:color="auto" w:sz="4" w:space="0"/>
-            <w:insideV w:val="single" w:color="auto" w:sz="4" w:space="0"/>
-          </w:tblBorders>
-          <w:tblCellMar>
-            <w:top w:w="0" w:type="dxa"/>
-            <w:left w:w="108" w:type="dxa"/>
-            <w:bottom w:w="0" w:type="dxa"/>
-            <w:right w:w="108" w:type="dxa"/>
-          </w:tblCellMar>
         </w:tblPrEx>
         <w:tc>
           <w:tcPr>

</xml_diff>